<commit_message>
Comprueba que no faltaban épocas y corrige la memoria de la entrega 2
Repite SSD300 VGG16 con 40 épocas (la única que seguía mejorando al final de las
12): el AP@0,5 pasa de 0,9008 a 0,9009, así que no estaba infraentrenada. Añade
sus resultados, la corrige en la memoria (tabla de hiperparámetros, párrafo de
épocas, frase sobre SSD300 y la de la tasa 0,002, que era sobreajuste y no
infraajuste) y regenera el PDF. La web añade esta serie a la figura de pérdida y
AP por entrenamiento y marca cuándo baja la tasa el planificador.
</commit_message>
<xml_diff>
--- a/docs/informes/informe_entrega2.docx
+++ b/docs/informes/informe_entrega2.docx
@@ -10509,7 +10509,7 @@
               <w:rPr>
                 <w:lang w:val="es-ES"/>
               </w:rPr>
-              <w:t>30 épocas; lote efectivo de 8 imágenes. En res1024, microbatch de 4 × 2</w:t>
+              <w:t>12 épocas (30 al inicio; 15 con lr 0,0005); lote efectivo de 8 imágenes. En res1024, microbatch de 4 × 2</w:t>
             </w:r>
             <w:r>
               <w:rPr>
@@ -10653,7 +10653,7 @@
               <w:rPr>
                 <w:lang w:val="es-ES"/>
               </w:rPr>
-              <w:t>0,0001 en los modelos originales y 0,001 en lr001 y res1024.</w:t>
+              <w:t>0,0001 en los originales; 0,001 en lr001, res1024 y arquitecturas; 0,0005 y 0,002 en variantes.</w:t>
             </w:r>
           </w:p>
         </w:tc>
@@ -11074,13 +11074,13 @@
         <w:rPr>
           <w:lang w:val="es-ES"/>
         </w:rPr>
-        <w:t xml:space="preserve"> Una época corresponde a una pasada completa por las imágenes de entrenamiento. Aunque se fijó un máximo de 30, no siempre es necesario llegar hasta el final. En seis de los siete modelos, el mejor checkpoint se obtiene entre las épocas 3 y 7; en SSD300 se alcanza en la 12. Además, la pérdida de validación llega a su mínimo en la época 4 y después aumenta, mientras la de entrenamiento sigue disminuyendo. Esto indica que el modelo puede empezar a sobreajustarse</w:t>
+        <w:t xml:space="preserve"> Una época corresponde a una pasada completa por las imágenes de entrenamiento. Los primeros experimentos usaron 30 épocas y los siete modelos, 12 (15 con lr 0,0005). En seis de los siete modelos, el mejor checkpoint está entre las épocas 3 y 7; SSD300, en la 12 (en la 18 con 40 épocas, con el mismo AP@0,5). La pérdida de validación toca su mínimo pronto (época 4 con 30 épocas) y después aumenta mientras la de entrenamiento baja: hay sobreajuste, no falta de épocas.</w:t>
       </w:r>
       <w:r>
         <w:rPr>
           <w:lang w:val="es-ES"/>
         </w:rPr>
-        <w:t xml:space="preserve">. </w:t>
+        <w:t xml:space="preserve"> </w:t>
       </w:r>
       <w:r>
         <w:rPr>
@@ -16181,37 +16181,32 @@
         <w:rPr>
           <w:lang w:val="es-ES"/>
         </w:rPr>
-        <w:t>Faster R-CNN v2 obtiene el mejor AP50 (0,9513), seguido de RetinaNet v2 (0,9447), Faster R-CNN v1 (0,9426) y RetinaNet v1 (0,9396). Los cuatro modelos con ResNet-50 presentan diferencias pequeñas, de apenas 1,2 puntos, por lo que no son concluyentes al haberse utilizado una sola semilla. Faster R-CNN alcanza su máximo entre las épocas 3 y 5 y después pierde entre 0,6 y 1 punto de AP mientras la pérdida de entrenamiento sigue bajando, lo que apunta a un sobreajuste temprano. RetinaNet comienza más despacio, pero mantiene un comportamiento más estable. SSD300 todavía mejora en la época 12, por lo que podría necesitar más entrenamiento, aunque no se probó con más épocas</w:t>
+        <w:t>Faster R-CNN v2 obtiene el mejor AP50 (0,9513), seguido de RetinaNet v2 (0,9447), Faster R-CNN v1 (0,9426) y RetinaNet v1 (0,9396). Los cuatro modelos con ResNet-50 presentan diferencias pequeñas, de apenas 1,2 puntos, por lo que no son concluyentes al haberse utilizado una sola semilla. Faster R-CNN alcanza su máximo entre las épocas 3 y 5 y después pierde entre 0,6 y 1 punto de AP mientras la pérdida de entrenamiento sigue bajando, lo que apunta a un sobreajuste temprano. RetinaNet comienza más despacio, pero mantiene un comportamiento más estable. SSD300 todavía mejoraba en la época 12, pero con 40 épocas el AP@0,5 pasa de 0,9008 a 0,9009: doce épocas no eran pocas.</w:t>
       </w:r>
       <w:r>
         <w:rPr>
           <w:lang w:val="es-ES"/>
         </w:rPr>
-        <w:t xml:space="preserve"> </w:t>
       </w:r>
       <w:r>
         <w:rPr>
           <w:lang w:val="es-ES"/>
         </w:rPr>
-        <w:t>por mantener todos los entrenamientos unificando hiperpar</w:t>
       </w:r>
       <w:r>
         <w:rPr>
           <w:lang w:val="es-ES"/>
         </w:rPr>
-        <w:t>á</w:t>
       </w:r>
       <w:r>
         <w:rPr>
           <w:lang w:val="es-ES"/>
         </w:rPr>
-        <w:t>metros</w:t>
       </w:r>
       <w:r>
         <w:rPr>
           <w:lang w:val="es-ES"/>
         </w:rPr>
-        <w:t>.</w:t>
       </w:r>
     </w:p>
     <w:p>
@@ -18632,7 +18627,7 @@
         <w:rPr>
           <w:lang w:val="es-ES"/>
         </w:rPr>
-        <w:t xml:space="preserve"> las diferencias son inferiores a 0,22 puntos, así que pueden deberse a la semilla. Se mantiene 0,001 porque logra resultados similares a 0,0005 en menos épocas. Con 0,002, Faster R-CNN alcanza su máximo en una o dos épocas y después pierde entre 1,1 y 1,4 puntos, señal de un entrenamiento insuficiente.</w:t>
+        <w:t xml:space="preserve"> las diferencias son inferiores a 0,22 puntos, así que pueden deberse a la semilla. Se mantiene 0,001 porque logra resultados similares a 0,0005 en menos épocas. Con 0,002, Faster R-CNN alcanza su máximo en una o dos épocas y después pierde entre 1,1 y 1,4 puntos, con la pérdida de validación subiendo (de 0,182 a 0,224 en la v2): inestabilidad y sobreajuste, no infraajuste.</w:t>
       </w:r>
     </w:p>
     <w:p>

</xml_diff>